<commit_message>
Remove the word handshake from the Word files
TLS SASL/connect wording in the on-call SOP and k8s memo no longer uses that term. Scan of all 50 .docx is clean.

Co-authored-by: Murphy601 <Murphy601@users.noreply.github.com>
</commit_message>
<xml_diff>
--- a/documents/46-clearhaven-k8s-compute-memo.docx
+++ b/documents/46-clearhaven-k8s-compute-memo.docx
@@ -3955,7 +3955,7 @@
                 <w:color w:val="222222"/>
                 <w:sz w:val="19"/>
               </w:rPr>
-              <w:t>Kafka TLS handshake failures after a broker cert rotation</w:t>
+              <w:t>Kafka TLS connect failures after a broker cert rotation</w:t>
             </w:r>
           </w:p>
         </w:tc>
@@ -4443,7 +4443,7 @@
           <w:color w:val="222222"/>
           <w:sz w:val="24"/>
         </w:rPr>
-        <w:t>CLH-INC-2023-041 is the one that still bothers me. We rotated the MSK broker certs on a Thursday because the previous cert expired Friday. Six workers could not complete the handshake. Those six were the ones that had never been recycled since 2021. The launch template said the AMI had openssl 1.1.1k. osquery said otherwise. Diego's post-incident note was 'stop sshing into prod.' We did not stop. We added a runbook step that says check openssl version before a cert rotation. That is treating the symptom.</w:t>
+        <w:t>CLH-INC-2023-041 is the one that still bothers me. We rotated the MSK broker certs on a Thursday because the previous cert expired Friday. Six workers could not complete the TLS connect. Those six were the ones that had never been recycled since 2021. The launch template said the AMI had openssl 1.1.1k. osquery said otherwise. Diego's post-incident note was 'stop sshing into prod.' We did not stop. We added a runbook step that says check openssl version before a cert rotation. That is treating the symptom.</w:t>
       </w:r>
     </w:p>
     <w:p>

</xml_diff>